<commit_message>
Nahum 2nd in-depth re-review (Sep 25): 3 EN MSG restorations asymmetric with KO (storm-clouds dust off His feet; anthill of evil plots; striding across the mountains), checker remaining 1 FP classified, GDocs 3/3 export-back verified
</commit_message>
<xml_diff>
--- a/gdocs_build/Nahum.docx
+++ b/gdocs_build/Nahum.docx
@@ -240,7 +240,7 @@
               <w:rPr>
                 <w:sz w:val="18"/>
               </w:rPr>
-              <w:t>God does NOT play. Seriously, don't mess with Him. He gets back at His haters and stands up to anyone who comes against Him, full force. But, like, He's not just flying off the handle. He's got incredible power, but He's patient with it. Still, nobody gets away with anything. Sooner or later, you gotta pay up. You see tornadoes and hurricanes? That's just the dust kicking up where He walks. He can literally tell the ocean to dry up, and it does. All the rivers? Gone. The mountains of Bashan and Carmel? Withered. The forests of Lebanon? Wilted. Mountains quake in their roots, hills dissolve into mud. The whole planet is freaking out in front of Him. The whole world is in a full-blown panic. Who could even handle that kind of anger? Who can stand up to that fire? His rage is like a volcano erupting, and He smashes boulders like nothing.</w:t>
+              <w:t>God does NOT play. Seriously, don't mess with Him. He gets back at His haters and stands up to anyone who comes against Him, full force. But, like, He's not just flying off the handle. He's got incredible power, but He's patient with it. Still, nobody gets away with anything. Sooner or later, you gotta pay up. You see tornadoes and hurricanes? That's just the wake of His passing. Storm clouds are the dust He shakes off His feet. He can literally tell the ocean to dry up, and it does. All the rivers? Gone. The mountains of Bashan and Carmel? Withered. The forests of Lebanon? Wilted. Mountains quake in their roots, hills dissolve into mud. The whole planet is freaking out in front of Him. The whole world is in a full-blown panic. Who could even handle that kind of anger? Who can stand up to that fire? His rage is like a volcano erupting, and He smashes boulders like nothing.</w:t>
             </w:r>
           </w:p>
         </w:tc>
@@ -427,7 +427,7 @@
               <w:rPr>
                 <w:sz w:val="18"/>
               </w:rPr>
-              <w:t>Nineveh is basically a headquarters for plotting against God. It's a think tank for lies that trick people and then stab them in the back.</w:t>
+              <w:t>Nineveh is like an anthill of evil plots against God. It's a think tank for lies that trick people and then stab them in the back.</w:t>
             </w:r>
           </w:p>
         </w:tc>
@@ -640,7 +640,7 @@
               <w:rPr>
                 <w:sz w:val="18"/>
               </w:rPr>
-              <w:t>Look! Someone's running over the mountains—a messenger with the best news: peace! It's a holiday, Judah! Go celebrate! Worship God and get right with Him again! You don't have to worry about this enemy anymore. They're history. Close the books.</w:t>
+              <w:t>Look! Someone's striding across the mountains—a messenger with the best news: peace! It's a holiday, Judah! Go celebrate! Worship God and get right with Him again! You don't have to worry about this enemy anymore. They're history. Close the books.</w:t>
             </w:r>
           </w:p>
         </w:tc>

</xml_diff>